<commit_message>
Regenerate all outputs from the current pipeline
Full re-run of Run_All.R. Picks up Tables 2 & 3 (the HT4/HT6 multivariable
regressions for NRS and SOWS, in both .xlsx and publication .docx/.html),
the config-caching fix -- which is what lets the figure styling below
actually take effect without an R restart -- and the enlarged figure text,
thicker points/lines, and per-panel facet axis rules, which is why every
.png/.tiff/.docx composite is touched.

Co-Authored-By: Claude Opus 5 <noreply@anthropic.com>
</commit_message>
<xml_diff>
--- a/New_Outputs/composites/stats_corner/Composite_Fig1_logMME_vs_outcomes.docx
+++ b/New_Outputs/composites/stats_corner/Composite_Fig1_logMME_vs_outcomes.docx
@@ -10,7 +10,7 @@
         <w:rPr/>
         <w:drawing>
           <wp:inline distT="0" distB="0" distL="0" distR="0">
-            <wp:extent cx="5943600" cy="3824007"/>
+            <wp:extent cx="5943600" cy="3890033"/>
             <wp:docPr id="1" name="" descr=""/>
             <wp:cNvGraphicFramePr>
               <a:graphicFrameLocks xmlns:a="http://schemas.openxmlformats.org/drawingml/2006/main" noChangeAspect="1"/>
@@ -33,7 +33,7 @@
                   <pic:spPr bwMode="auto">
                     <a:xfrm>
                       <a:off x="0" y="0"/>
-                      <a:ext cx="5943600" cy="3824007"/>
+                      <a:ext cx="5943600" cy="3890033"/>
                     </a:xfrm>
                     <a:prstGeom prst="rect">
                       <a:avLst/>

</xml_diff>